<commit_message>
Stable 3.6.2 Java "Mejoras de Actas"
</commit_message>
<xml_diff>
--- a/backend/src/main/resources/plantillas/ActaFormateoSeguro.docx
+++ b/backend/src/main/resources/plantillas/ActaFormateoSeguro.docx
@@ -2697,9 +2697,8 @@
                 <w:sz w:val="24"/>
                 <w:szCs w:val="24"/>
               </w:rPr>
-              <w:t>entregado_a</w:t>
-            </w:r>
-            <w:proofErr w:type="spellEnd"/>
+              <w:t>entregado_</w:t>
+            </w:r>
             <w:r>
               <w:rPr>
                 <w:spacing w:val="-2"/>
@@ -2707,6 +2706,16 @@
                 <w:sz w:val="24"/>
                 <w:szCs w:val="24"/>
               </w:rPr>
+              <w:t>por</w:t>
+            </w:r>
+            <w:proofErr w:type="spellEnd"/>
+            <w:r>
+              <w:rPr>
+                <w:spacing w:val="-2"/>
+                <w:w w:val="90"/>
+                <w:sz w:val="24"/>
+                <w:szCs w:val="24"/>
+              </w:rPr>
               <w:t>}}</w:t>
             </w:r>
           </w:p>
@@ -2751,7 +2760,31 @@
                 <w:sz w:val="24"/>
                 <w:szCs w:val="24"/>
               </w:rPr>
-              <w:t>entrega_por</w:t>
+              <w:t>entrega</w:t>
+            </w:r>
+            <w:r>
+              <w:rPr>
+                <w:w w:val="80"/>
+                <w:sz w:val="24"/>
+                <w:szCs w:val="24"/>
+              </w:rPr>
+              <w:t>do</w:t>
+            </w:r>
+            <w:r>
+              <w:rPr>
+                <w:w w:val="80"/>
+                <w:sz w:val="24"/>
+                <w:szCs w:val="24"/>
+              </w:rPr>
+              <w:t>_</w:t>
+            </w:r>
+            <w:r>
+              <w:rPr>
+                <w:w w:val="80"/>
+                <w:sz w:val="24"/>
+                <w:szCs w:val="24"/>
+              </w:rPr>
+              <w:t>a</w:t>
             </w:r>
             <w:proofErr w:type="spellEnd"/>
             <w:r>
@@ -2804,55 +2837,71 @@
                 <w:sz w:val="24"/>
                 <w:szCs w:val="24"/>
               </w:rPr>
-              <w:t>cargo_recibe</w:t>
-            </w:r>
-            <w:proofErr w:type="spellEnd"/>
+              <w:t>cargo_</w:t>
+            </w:r>
             <w:r>
               <w:rPr>
                 <w:w w:val="80"/>
                 <w:sz w:val="24"/>
                 <w:szCs w:val="24"/>
               </w:rPr>
-              <w:t>}}</w:t>
-            </w:r>
-          </w:p>
-        </w:tc>
-        <w:tc>
-          <w:tcPr>
-            <w:tcW w:w="3520" w:type="dxa"/>
-            <w:vAlign w:val="center"/>
-          </w:tcPr>
-          <w:p>
-            <w:pPr>
-              <w:pStyle w:val="TableParagraph"/>
-              <w:spacing w:line="234" w:lineRule="exact"/>
-              <w:ind w:left="110"/>
-              <w:jc w:val="center"/>
-            </w:pPr>
+              <w:t>entrega</w:t>
+            </w:r>
+            <w:proofErr w:type="spellEnd"/>
             <w:r>
               <w:rPr>
                 <w:w w:val="80"/>
                 <w:sz w:val="24"/>
                 <w:szCs w:val="24"/>
               </w:rPr>
-              <w:t>Cargo</w:t>
-            </w:r>
+              <w:t>}}</w:t>
+            </w:r>
+          </w:p>
+        </w:tc>
+        <w:tc>
+          <w:tcPr>
+            <w:tcW w:w="3520" w:type="dxa"/>
+            <w:vAlign w:val="center"/>
+          </w:tcPr>
+          <w:p>
+            <w:pPr>
+              <w:pStyle w:val="TableParagraph"/>
+              <w:spacing w:line="234" w:lineRule="exact"/>
+              <w:ind w:left="110"/>
+              <w:jc w:val="center"/>
+            </w:pPr>
             <w:r>
               <w:rPr>
                 <w:w w:val="80"/>
                 <w:sz w:val="24"/>
                 <w:szCs w:val="24"/>
               </w:rPr>
-              <w:t>: {{</w:t>
-            </w:r>
-            <w:proofErr w:type="spellStart"/>
+              <w:t>Cargo</w:t>
+            </w:r>
             <w:r>
               <w:rPr>
                 <w:w w:val="80"/>
                 <w:sz w:val="24"/>
                 <w:szCs w:val="24"/>
               </w:rPr>
-              <w:t>cargo_entrega</w:t>
+              <w:t>: {{</w:t>
+            </w:r>
+            <w:proofErr w:type="spellStart"/>
+            <w:r>
+              <w:rPr>
+                <w:w w:val="80"/>
+                <w:sz w:val="24"/>
+                <w:szCs w:val="24"/>
+              </w:rPr>
+              <w:t>cargo_</w:t>
+            </w:r>
+            <w:r>
+              <w:rPr>
+                <w:w w:val="80"/>
+                <w:sz w:val="24"/>
+                <w:szCs w:val="24"/>
+              </w:rPr>
+              <w:t>recibe</w:t>
             </w:r>
             <w:proofErr w:type="spellEnd"/>
             <w:r>

</xml_diff>